<commit_message>
Unify comparison legends and add shared Docomo UE reference to CPU figures
</commit_message>
<xml_diff>
--- a/8.单流/docs/UPA单流400位置正式实验报告.docx
+++ b/8.单流/docs/UPA单流400位置正式实验报告.docx
@@ -637,7 +637,7 @@
     </w:p>
     <w:p>
       <w:r>
-        <w:t>位置反馈由连续HAQSE频率在UE定位，然后仅量化一次坐标，固定13/14/9 bit。UE按CPU同样的解码规则恢复波束，再用观测CSI计算共相位。CPU则只凭空间消息和公共几何重构模型并计算相位，不接收参考AP完整观测信道。上述核心口径此前已在第5、第6目录建立，本轮是恢复新增单流入口的一致性并补齐完整消息重放。</w:t>
+        <w:t>位置反馈由连续空间频率在UE定位，然后仅量化一次坐标，固定13/14/9 bit。UE按CPU同样的解码规则恢复波束，再用观测CSI计算共相位。CPU则只凭空间消息和公共几何重构模型并计算相位，不接收参考AP完整观测信道。上述核心口径此前已在第5、第6目录建立，本轮是恢复新增单流入口的一致性并补齐完整消息重放。</w:t>
       </w:r>
     </w:p>
     <w:p>
@@ -650,7 +650,7 @@
         <w:pStyle w:val="Heading1"/>
       </w:pPr>
       <w:r>
-        <w:t>Docomo结构适配与验证</w:t>
+        <w:t>Docomo实现与验证</w:t>
       </w:r>
     </w:p>
     <w:p>
@@ -681,7 +681,7 @@
         <w:keepNext/>
       </w:pPr>
       <w:r>
-        <w:t>下表为默认配置的400位置均值，仅列CPU三种几何方法。</w:t>
+        <w:t>下表为默认配置的400位置均值，列出CPU三种几何方法和Docomo(UE)共享参考。</w:t>
       </w:r>
     </w:p>
     <w:tbl>
@@ -843,7 +843,7 @@
                 <w:b w:val="0"/>
                 <w:sz w:val="21"/>
               </w:rPr>
-              <w:t>HAQSE</w:t>
+              <w:t>空间频率</w:t>
             </w:r>
           </w:p>
         </w:tc>
@@ -1051,6 +1051,114 @@
           </w:tcPr>
           <w:p>
             <w:pPr>
+              <w:keepNext/>
+              <w:spacing w:after="0" w:line="252" w:lineRule="auto"/>
+            </w:pPr>
+            <w:r>
+              <w:rPr>
+                <w:b w:val="0"/>
+                <w:sz w:val="21"/>
+              </w:rPr>
+              <w:t>位置反馈</w:t>
+            </w:r>
+          </w:p>
+        </w:tc>
+        <w:tc>
+          <w:tcPr>
+            <w:tcW w:type="dxa" w:w="2472"/>
+            <w:vAlign w:val="center"/>
+            <w:tcMar>
+              <w:top w:w="50" w:type="dxa"/>
+              <w:bottom w:w="50" w:type="dxa"/>
+              <w:left w:w="80" w:type="dxa"/>
+              <w:right w:w="80" w:type="dxa"/>
+            </w:tcMar>
+          </w:tcPr>
+          <w:p>
+            <w:pPr>
+              <w:keepNext/>
+              <w:spacing w:after="0" w:line="252" w:lineRule="auto"/>
+              <w:jc w:val="center"/>
+            </w:pPr>
+            <w:r>
+              <w:rPr>
+                <w:b w:val="0"/>
+                <w:sz w:val="21"/>
+              </w:rPr>
+              <w:t>3184.002</w:t>
+            </w:r>
+          </w:p>
+        </w:tc>
+        <w:tc>
+          <w:tcPr>
+            <w:tcW w:type="dxa" w:w="2472"/>
+            <w:vAlign w:val="center"/>
+            <w:tcMar>
+              <w:top w:w="50" w:type="dxa"/>
+              <w:bottom w:w="50" w:type="dxa"/>
+              <w:left w:w="80" w:type="dxa"/>
+              <w:right w:w="80" w:type="dxa"/>
+            </w:tcMar>
+          </w:tcPr>
+          <w:p>
+            <w:pPr>
+              <w:keepNext/>
+              <w:spacing w:after="0" w:line="252" w:lineRule="auto"/>
+              <w:jc w:val="center"/>
+            </w:pPr>
+            <w:r>
+              <w:rPr>
+                <w:b w:val="0"/>
+                <w:sz w:val="21"/>
+              </w:rPr>
+              <w:t>0.009490</w:t>
+            </w:r>
+          </w:p>
+        </w:tc>
+        <w:tc>
+          <w:tcPr>
+            <w:tcW w:type="dxa" w:w="2472"/>
+            <w:vAlign w:val="center"/>
+            <w:tcMar>
+              <w:top w:w="50" w:type="dxa"/>
+              <w:bottom w:w="50" w:type="dxa"/>
+              <w:left w:w="80" w:type="dxa"/>
+              <w:right w:w="80" w:type="dxa"/>
+            </w:tcMar>
+          </w:tcPr>
+          <w:p>
+            <w:pPr>
+              <w:keepNext/>
+              <w:spacing w:after="0" w:line="252" w:lineRule="auto"/>
+              <w:jc w:val="center"/>
+            </w:pPr>
+            <w:r>
+              <w:rPr>
+                <w:b w:val="0"/>
+                <w:sz w:val="21"/>
+              </w:rPr>
+              <w:t>36</w:t>
+            </w:r>
+          </w:p>
+        </w:tc>
+      </w:tr>
+      <w:tr>
+        <w:trPr>
+          <w:cantSplit/>
+        </w:trPr>
+        <w:tc>
+          <w:tcPr>
+            <w:tcW w:type="dxa" w:w="2376"/>
+            <w:vAlign w:val="center"/>
+            <w:tcMar>
+              <w:top w:w="50" w:type="dxa"/>
+              <w:bottom w:w="50" w:type="dxa"/>
+              <w:left w:w="80" w:type="dxa"/>
+              <w:right w:w="80" w:type="dxa"/>
+            </w:tcMar>
+          </w:tcPr>
+          <w:p>
+            <w:pPr>
               <w:keepNext w:val="0"/>
               <w:spacing w:after="0" w:line="252" w:lineRule="auto"/>
             </w:pPr>
@@ -1059,7 +1167,7 @@
                 <w:b w:val="0"/>
                 <w:sz w:val="21"/>
               </w:rPr>
-              <w:t>位置反馈</w:t>
+              <w:t>Docomo(UE)</w:t>
             </w:r>
           </w:p>
         </w:tc>
@@ -1085,7 +1193,7 @@
                 <w:b w:val="0"/>
                 <w:sz w:val="21"/>
               </w:rPr>
-              <w:t>3184.002</w:t>
+              <w:t>3347.721</w:t>
             </w:r>
           </w:p>
         </w:tc>
@@ -1111,7 +1219,7 @@
                 <w:b w:val="0"/>
                 <w:sz w:val="21"/>
               </w:rPr>
-              <w:t>0.009490</w:t>
+              <w:t>不适用</w:t>
             </w:r>
           </w:p>
         </w:tc>
@@ -1137,7 +1245,7 @@
                 <w:b w:val="0"/>
                 <w:sz w:val="21"/>
               </w:rPr>
-              <w:t>36</w:t>
+              <w:t>129</w:t>
             </w:r>
           </w:p>
         </w:tc>
@@ -1150,12 +1258,12 @@
     </w:p>
     <w:p>
       <w:r>
-        <w:t>位置反馈以36 bit获得3184.002 Mbps，HAQSE频率反馈以84 bit获得3177.396 Mbps，当前默认点两者速率相近。位置误差略大并不必然导致更低速率，因为坐标量化按相对相位敏感度分配，定位欧氏误差不是唯一性能因素。DFT索引定位误差较大，对CPU几何共相位的影响更明显。</w:t>
+        <w:t>位置反馈以36 bit获得3184.002 Mbps，空间频率反馈以84 bit获得3177.396 Mbps，当前默认点两者速率相近。位置误差略大并不必然导致更低速率，因为坐标量化按相对相位敏感度分配，定位欧氏误差不是唯一性能因素。DFT索引定位误差较大，对CPU几何共相位的影响更明显。</w:t>
       </w:r>
     </w:p>
     <w:p>
       <w:r>
-        <w:t>CPU图中的Type-I/II是UE计算的共享参考，不是CPU几何算法。其默认均值为3298.510/3324.283 Mbps；理想单流SVD为3543.540 Mbps。</w:t>
+        <w:t>CPU图中的全反馈Type-I(UE)、全反馈Type-II(UE)和Docomo(UE)均为UE计算的共享参考。默认均值分别为3298.510、3324.283和3347.721 Mbps；理想单流SVD为3543.540 Mbps。Docomo(UE)反馈129 bit，结果直接复用UE数据，不新增CPU算法或样本。定位误差图只列有位置输出的三种几何方法。</w:t>
       </w:r>
     </w:p>
     <w:p>
@@ -1333,7 +1441,7 @@
                 <w:b w:val="0"/>
                 <w:sz w:val="21"/>
               </w:rPr>
-              <w:t>项目Type-I 含共相位</w:t>
+              <w:t>全反馈Type-I(UE)</w:t>
             </w:r>
           </w:p>
         </w:tc>
@@ -1441,7 +1549,7 @@
                 <w:b w:val="0"/>
                 <w:sz w:val="21"/>
               </w:rPr>
-              <w:t>项目Type-II</w:t>
+              <w:t>全反馈Type-II(UE)</w:t>
             </w:r>
           </w:p>
         </w:tc>
@@ -1549,7 +1657,7 @@
                 <w:b w:val="0"/>
                 <w:sz w:val="21"/>
               </w:rPr>
-              <w:t>Docomo结构适配</w:t>
+              <w:t>Docomo</w:t>
             </w:r>
           </w:p>
         </w:tc>
@@ -1657,7 +1765,7 @@
                 <w:b w:val="0"/>
                 <w:sz w:val="21"/>
               </w:rPr>
-              <w:t>HAQSE</w:t>
+              <w:t>空间频率</w:t>
             </w:r>
           </w:p>
         </w:tc>
@@ -1964,12 +2072,12 @@
     </w:p>
     <w:p>
       <w:r>
-        <w:t>位置反馈与HAQSE默认平均速率分别为3307.261和3307.265 Mbps，而反馈64与112 bit，减少约42.9%。这支持本配置下位置反馈的压缩价值，不宣称所有配置严格等效。UE由观测信道计算共相位，能补偿部分定位误差对跨AP相位的影响；因此DFT方案在UE侧比CPU侧更接近其他几何方法。</w:t>
+        <w:t>位置反馈与空间频率默认平均速率分别为3307.261和3307.265 Mbps，而反馈64与112 bit，减少约42.9%。这支持本配置下位置反馈的压缩价值，不宣称所有配置严格等效。UE由观测信道计算共相位，能补偿部分定位误差对跨AP相位的影响；因此DFT方案在UE侧比CPU侧更接近其他几何方法。</w:t>
       </w:r>
     </w:p>
     <w:p>
       <w:r>
-        <w:t>Docomo结构适配在此配置达到3347.721 Mbps、129 bit。由于场景、码本和项目基线定义与论文不同，不将本排序称为论文图表复现。</w:t>
+        <w:t>Docomo在此配置达到3347.721 Mbps、129 bit。由于场景、码本和项目基线定义与论文不同，不将本排序称为论文图表复现。</w:t>
       </w:r>
     </w:p>
     <w:p>
@@ -2723,7 +2831,7 @@
     </w:p>
     <w:p>
       <w:r>
-        <w:t>以下每图均使用400位置均值，信道固定为MIX。各表列标题是图中的实际横轴数值，CPU图中的Type-I和Type-II为UE计算的共享参考；所有方法均列入对应吞吐量或开销表。</w:t>
+        <w:t>以下每图均使用400位置均值，信道固定为MIX。各表列标题是图中的实际横轴数值；CPU图中的全反馈Type-I(UE)、全反馈Type-II(UE)和Docomo(UE)均为UE计算的共享参考，定位误差图只列三种几何方法。</w:t>
       </w:r>
     </w:p>
     <w:p>
@@ -2957,7 +3065,7 @@
                 <w:b w:val="0"/>
                 <w:sz w:val="21"/>
               </w:rPr>
-              <w:t>HAQSE</w:t>
+              <w:t>空间频率</w:t>
             </w:r>
           </w:p>
         </w:tc>
@@ -3650,7 +3758,7 @@
                 <w:b w:val="0"/>
                 <w:sz w:val="21"/>
               </w:rPr>
-              <w:t>HAQSE</w:t>
+              <w:t>空间频率</w:t>
             </w:r>
           </w:p>
         </w:tc>
@@ -4271,7 +4379,7 @@
                 <w:b w:val="0"/>
                 <w:sz w:val="21"/>
               </w:rPr>
-              <w:t>HAQSE</w:t>
+              <w:t>空间频率</w:t>
             </w:r>
           </w:p>
         </w:tc>
@@ -5258,7 +5366,7 @@
                 <w:b w:val="0"/>
                 <w:sz w:val="21"/>
               </w:rPr>
-              <w:t>Type-I</w:t>
+              <w:t>全反馈Type-I(UE)</w:t>
             </w:r>
           </w:p>
         </w:tc>
@@ -5418,7 +5526,7 @@
                 <w:b w:val="0"/>
                 <w:sz w:val="21"/>
               </w:rPr>
-              <w:t>Type-II</w:t>
+              <w:t>全反馈Type-II(UE)</w:t>
             </w:r>
           </w:p>
         </w:tc>
@@ -5578,7 +5686,167 @@
                 <w:b w:val="0"/>
                 <w:sz w:val="21"/>
               </w:rPr>
-              <w:t>HAQSE</w:t>
+              <w:t>Docomo(UE)</w:t>
+            </w:r>
+          </w:p>
+        </w:tc>
+        <w:tc>
+          <w:tcPr>
+            <w:tcW w:type="dxa" w:w="1483"/>
+            <w:vAlign w:val="center"/>
+            <w:tcMar>
+              <w:top w:w="50" w:type="dxa"/>
+              <w:bottom w:w="50" w:type="dxa"/>
+              <w:left w:w="80" w:type="dxa"/>
+              <w:right w:w="80" w:type="dxa"/>
+            </w:tcMar>
+          </w:tcPr>
+          <w:p>
+            <w:pPr>
+              <w:keepNext/>
+              <w:spacing w:after="0" w:line="252" w:lineRule="auto"/>
+              <w:jc w:val="center"/>
+            </w:pPr>
+            <w:r>
+              <w:rPr>
+                <w:b w:val="0"/>
+                <w:sz w:val="21"/>
+              </w:rPr>
+              <w:t>3347.99</w:t>
+            </w:r>
+          </w:p>
+        </w:tc>
+        <w:tc>
+          <w:tcPr>
+            <w:tcW w:type="dxa" w:w="1483"/>
+            <w:vAlign w:val="center"/>
+            <w:tcMar>
+              <w:top w:w="50" w:type="dxa"/>
+              <w:bottom w:w="50" w:type="dxa"/>
+              <w:left w:w="80" w:type="dxa"/>
+              <w:right w:w="80" w:type="dxa"/>
+            </w:tcMar>
+          </w:tcPr>
+          <w:p>
+            <w:pPr>
+              <w:keepNext/>
+              <w:spacing w:after="0" w:line="252" w:lineRule="auto"/>
+              <w:jc w:val="center"/>
+            </w:pPr>
+            <w:r>
+              <w:rPr>
+                <w:b w:val="0"/>
+                <w:sz w:val="21"/>
+              </w:rPr>
+              <w:t>3347.89</w:t>
+            </w:r>
+          </w:p>
+        </w:tc>
+        <w:tc>
+          <w:tcPr>
+            <w:tcW w:type="dxa" w:w="1483"/>
+            <w:vAlign w:val="center"/>
+            <w:tcMar>
+              <w:top w:w="50" w:type="dxa"/>
+              <w:bottom w:w="50" w:type="dxa"/>
+              <w:left w:w="80" w:type="dxa"/>
+              <w:right w:w="80" w:type="dxa"/>
+            </w:tcMar>
+          </w:tcPr>
+          <w:p>
+            <w:pPr>
+              <w:keepNext/>
+              <w:spacing w:after="0" w:line="252" w:lineRule="auto"/>
+              <w:jc w:val="center"/>
+            </w:pPr>
+            <w:r>
+              <w:rPr>
+                <w:b w:val="0"/>
+                <w:sz w:val="21"/>
+              </w:rPr>
+              <w:t>3347.72</w:t>
+            </w:r>
+          </w:p>
+        </w:tc>
+        <w:tc>
+          <w:tcPr>
+            <w:tcW w:type="dxa" w:w="1483"/>
+            <w:vAlign w:val="center"/>
+            <w:tcMar>
+              <w:top w:w="50" w:type="dxa"/>
+              <w:bottom w:w="50" w:type="dxa"/>
+              <w:left w:w="80" w:type="dxa"/>
+              <w:right w:w="80" w:type="dxa"/>
+            </w:tcMar>
+          </w:tcPr>
+          <w:p>
+            <w:pPr>
+              <w:keepNext/>
+              <w:spacing w:after="0" w:line="252" w:lineRule="auto"/>
+              <w:jc w:val="center"/>
+            </w:pPr>
+            <w:r>
+              <w:rPr>
+                <w:b w:val="0"/>
+                <w:sz w:val="21"/>
+              </w:rPr>
+              <w:t>3347.73</w:t>
+            </w:r>
+          </w:p>
+        </w:tc>
+        <w:tc>
+          <w:tcPr>
+            <w:tcW w:type="dxa" w:w="1483"/>
+            <w:vAlign w:val="center"/>
+            <w:tcMar>
+              <w:top w:w="50" w:type="dxa"/>
+              <w:bottom w:w="50" w:type="dxa"/>
+              <w:left w:w="80" w:type="dxa"/>
+              <w:right w:w="80" w:type="dxa"/>
+            </w:tcMar>
+          </w:tcPr>
+          <w:p>
+            <w:pPr>
+              <w:keepNext/>
+              <w:spacing w:after="0" w:line="252" w:lineRule="auto"/>
+              <w:jc w:val="center"/>
+            </w:pPr>
+            <w:r>
+              <w:rPr>
+                <w:b w:val="0"/>
+                <w:sz w:val="21"/>
+              </w:rPr>
+              <w:t>3347.76</w:t>
+            </w:r>
+          </w:p>
+        </w:tc>
+      </w:tr>
+      <w:tr>
+        <w:trPr>
+          <w:cantSplit/>
+        </w:trPr>
+        <w:tc>
+          <w:tcPr>
+            <w:tcW w:type="dxa" w:w="2376"/>
+            <w:vAlign w:val="center"/>
+            <w:tcMar>
+              <w:top w:w="50" w:type="dxa"/>
+              <w:bottom w:w="50" w:type="dxa"/>
+              <w:left w:w="80" w:type="dxa"/>
+              <w:right w:w="80" w:type="dxa"/>
+            </w:tcMar>
+          </w:tcPr>
+          <w:p>
+            <w:pPr>
+              <w:keepNext/>
+              <w:spacing w:after="0" w:line="252" w:lineRule="auto"/>
+            </w:pPr>
+            <w:r>
+              <w:rPr>
+                <w:b w:val="0"/>
+                <w:sz w:val="21"/>
+              </w:rPr>
+              <w:t>空间频率</w:t>
             </w:r>
           </w:p>
         </w:tc>
@@ -6379,7 +6647,7 @@
                 <w:b w:val="0"/>
                 <w:sz w:val="21"/>
               </w:rPr>
-              <w:t>Type-I</w:t>
+              <w:t>全反馈Type-I(UE)</w:t>
             </w:r>
           </w:p>
         </w:tc>
@@ -6487,7 +6755,7 @@
                 <w:b w:val="0"/>
                 <w:sz w:val="21"/>
               </w:rPr>
-              <w:t>Type-II</w:t>
+              <w:t>全反馈Type-II(UE)</w:t>
             </w:r>
           </w:p>
         </w:tc>
@@ -6595,7 +6863,115 @@
                 <w:b w:val="0"/>
                 <w:sz w:val="21"/>
               </w:rPr>
-              <w:t>HAQSE</w:t>
+              <w:t>Docomo(UE)</w:t>
+            </w:r>
+          </w:p>
+        </w:tc>
+        <w:tc>
+          <w:tcPr>
+            <w:tcW w:type="dxa" w:w="2472"/>
+            <w:vAlign w:val="center"/>
+            <w:tcMar>
+              <w:top w:w="50" w:type="dxa"/>
+              <w:bottom w:w="50" w:type="dxa"/>
+              <w:left w:w="80" w:type="dxa"/>
+              <w:right w:w="80" w:type="dxa"/>
+            </w:tcMar>
+          </w:tcPr>
+          <w:p>
+            <w:pPr>
+              <w:keepNext/>
+              <w:spacing w:after="0" w:line="252" w:lineRule="auto"/>
+              <w:jc w:val="center"/>
+            </w:pPr>
+            <w:r>
+              <w:rPr>
+                <w:b w:val="0"/>
+                <w:sz w:val="21"/>
+              </w:rPr>
+              <w:t>1795.17</w:t>
+            </w:r>
+          </w:p>
+        </w:tc>
+        <w:tc>
+          <w:tcPr>
+            <w:tcW w:type="dxa" w:w="2472"/>
+            <w:vAlign w:val="center"/>
+            <w:tcMar>
+              <w:top w:w="50" w:type="dxa"/>
+              <w:bottom w:w="50" w:type="dxa"/>
+              <w:left w:w="80" w:type="dxa"/>
+              <w:right w:w="80" w:type="dxa"/>
+            </w:tcMar>
+          </w:tcPr>
+          <w:p>
+            <w:pPr>
+              <w:keepNext/>
+              <w:spacing w:after="0" w:line="252" w:lineRule="auto"/>
+              <w:jc w:val="center"/>
+            </w:pPr>
+            <w:r>
+              <w:rPr>
+                <w:b w:val="0"/>
+                <w:sz w:val="21"/>
+              </w:rPr>
+              <w:t>2563.97</w:t>
+            </w:r>
+          </w:p>
+        </w:tc>
+        <w:tc>
+          <w:tcPr>
+            <w:tcW w:type="dxa" w:w="2472"/>
+            <w:vAlign w:val="center"/>
+            <w:tcMar>
+              <w:top w:w="50" w:type="dxa"/>
+              <w:bottom w:w="50" w:type="dxa"/>
+              <w:left w:w="80" w:type="dxa"/>
+              <w:right w:w="80" w:type="dxa"/>
+            </w:tcMar>
+          </w:tcPr>
+          <w:p>
+            <w:pPr>
+              <w:keepNext/>
+              <w:spacing w:after="0" w:line="252" w:lineRule="auto"/>
+              <w:jc w:val="center"/>
+            </w:pPr>
+            <w:r>
+              <w:rPr>
+                <w:b w:val="0"/>
+                <w:sz w:val="21"/>
+              </w:rPr>
+              <w:t>3347.72</w:t>
+            </w:r>
+          </w:p>
+        </w:tc>
+      </w:tr>
+      <w:tr>
+        <w:trPr>
+          <w:cantSplit/>
+        </w:trPr>
+        <w:tc>
+          <w:tcPr>
+            <w:tcW w:type="dxa" w:w="2376"/>
+            <w:vAlign w:val="center"/>
+            <w:tcMar>
+              <w:top w:w="50" w:type="dxa"/>
+              <w:bottom w:w="50" w:type="dxa"/>
+              <w:left w:w="80" w:type="dxa"/>
+              <w:right w:w="80" w:type="dxa"/>
+            </w:tcMar>
+          </w:tcPr>
+          <w:p>
+            <w:pPr>
+              <w:keepNext/>
+              <w:spacing w:after="0" w:line="252" w:lineRule="auto"/>
+            </w:pPr>
+            <w:r>
+              <w:rPr>
+                <w:b w:val="0"/>
+                <w:sz w:val="21"/>
+              </w:rPr>
+              <w:t>空间频率</w:t>
             </w:r>
           </w:p>
         </w:tc>
@@ -7348,7 +7724,7 @@
                 <w:b w:val="0"/>
                 <w:sz w:val="21"/>
               </w:rPr>
-              <w:t>Type-I</w:t>
+              <w:t>全反馈Type-I(UE)</w:t>
             </w:r>
           </w:p>
         </w:tc>
@@ -7508,7 +7884,7 @@
                 <w:b w:val="0"/>
                 <w:sz w:val="21"/>
               </w:rPr>
-              <w:t>Type-II</w:t>
+              <w:t>全反馈Type-II(UE)</w:t>
             </w:r>
           </w:p>
         </w:tc>
@@ -7668,7 +8044,167 @@
                 <w:b w:val="0"/>
                 <w:sz w:val="21"/>
               </w:rPr>
-              <w:t>HAQSE</w:t>
+              <w:t>Docomo(UE)</w:t>
+            </w:r>
+          </w:p>
+        </w:tc>
+        <w:tc>
+          <w:tcPr>
+            <w:tcW w:type="dxa" w:w="1483"/>
+            <w:vAlign w:val="center"/>
+            <w:tcMar>
+              <w:top w:w="50" w:type="dxa"/>
+              <w:bottom w:w="50" w:type="dxa"/>
+              <w:left w:w="80" w:type="dxa"/>
+              <w:right w:w="80" w:type="dxa"/>
+            </w:tcMar>
+          </w:tcPr>
+          <w:p>
+            <w:pPr>
+              <w:keepNext/>
+              <w:spacing w:after="0" w:line="252" w:lineRule="auto"/>
+              <w:jc w:val="center"/>
+            </w:pPr>
+            <w:r>
+              <w:rPr>
+                <w:b w:val="0"/>
+                <w:sz w:val="21"/>
+              </w:rPr>
+              <w:t>3143.30</w:t>
+            </w:r>
+          </w:p>
+        </w:tc>
+        <w:tc>
+          <w:tcPr>
+            <w:tcW w:type="dxa" w:w="1483"/>
+            <w:vAlign w:val="center"/>
+            <w:tcMar>
+              <w:top w:w="50" w:type="dxa"/>
+              <w:bottom w:w="50" w:type="dxa"/>
+              <w:left w:w="80" w:type="dxa"/>
+              <w:right w:w="80" w:type="dxa"/>
+            </w:tcMar>
+          </w:tcPr>
+          <w:p>
+            <w:pPr>
+              <w:keepNext/>
+              <w:spacing w:after="0" w:line="252" w:lineRule="auto"/>
+              <w:jc w:val="center"/>
+            </w:pPr>
+            <w:r>
+              <w:rPr>
+                <w:b w:val="0"/>
+                <w:sz w:val="21"/>
+              </w:rPr>
+              <w:t>3252.61</w:t>
+            </w:r>
+          </w:p>
+        </w:tc>
+        <w:tc>
+          <w:tcPr>
+            <w:tcW w:type="dxa" w:w="1483"/>
+            <w:vAlign w:val="center"/>
+            <w:tcMar>
+              <w:top w:w="50" w:type="dxa"/>
+              <w:bottom w:w="50" w:type="dxa"/>
+              <w:left w:w="80" w:type="dxa"/>
+              <w:right w:w="80" w:type="dxa"/>
+            </w:tcMar>
+          </w:tcPr>
+          <w:p>
+            <w:pPr>
+              <w:keepNext/>
+              <w:spacing w:after="0" w:line="252" w:lineRule="auto"/>
+              <w:jc w:val="center"/>
+            </w:pPr>
+            <w:r>
+              <w:rPr>
+                <w:b w:val="0"/>
+                <w:sz w:val="21"/>
+              </w:rPr>
+              <w:t>3347.72</w:t>
+            </w:r>
+          </w:p>
+        </w:tc>
+        <w:tc>
+          <w:tcPr>
+            <w:tcW w:type="dxa" w:w="1483"/>
+            <w:vAlign w:val="center"/>
+            <w:tcMar>
+              <w:top w:w="50" w:type="dxa"/>
+              <w:bottom w:w="50" w:type="dxa"/>
+              <w:left w:w="80" w:type="dxa"/>
+              <w:right w:w="80" w:type="dxa"/>
+            </w:tcMar>
+          </w:tcPr>
+          <w:p>
+            <w:pPr>
+              <w:keepNext/>
+              <w:spacing w:after="0" w:line="252" w:lineRule="auto"/>
+              <w:jc w:val="center"/>
+            </w:pPr>
+            <w:r>
+              <w:rPr>
+                <w:b w:val="0"/>
+                <w:sz w:val="21"/>
+              </w:rPr>
+              <w:t>3382.88</w:t>
+            </w:r>
+          </w:p>
+        </w:tc>
+        <w:tc>
+          <w:tcPr>
+            <w:tcW w:type="dxa" w:w="1483"/>
+            <w:vAlign w:val="center"/>
+            <w:tcMar>
+              <w:top w:w="50" w:type="dxa"/>
+              <w:bottom w:w="50" w:type="dxa"/>
+              <w:left w:w="80" w:type="dxa"/>
+              <w:right w:w="80" w:type="dxa"/>
+            </w:tcMar>
+          </w:tcPr>
+          <w:p>
+            <w:pPr>
+              <w:keepNext/>
+              <w:spacing w:after="0" w:line="252" w:lineRule="auto"/>
+              <w:jc w:val="center"/>
+            </w:pPr>
+            <w:r>
+              <w:rPr>
+                <w:b w:val="0"/>
+                <w:sz w:val="21"/>
+              </w:rPr>
+              <w:t>3394.78</w:t>
+            </w:r>
+          </w:p>
+        </w:tc>
+      </w:tr>
+      <w:tr>
+        <w:trPr>
+          <w:cantSplit/>
+        </w:trPr>
+        <w:tc>
+          <w:tcPr>
+            <w:tcW w:type="dxa" w:w="2376"/>
+            <w:vAlign w:val="center"/>
+            <w:tcMar>
+              <w:top w:w="50" w:type="dxa"/>
+              <w:bottom w:w="50" w:type="dxa"/>
+              <w:left w:w="80" w:type="dxa"/>
+              <w:right w:w="80" w:type="dxa"/>
+            </w:tcMar>
+          </w:tcPr>
+          <w:p>
+            <w:pPr>
+              <w:keepNext/>
+              <w:spacing w:after="0" w:line="252" w:lineRule="auto"/>
+            </w:pPr>
+            <w:r>
+              <w:rPr>
+                <w:b w:val="0"/>
+                <w:sz w:val="21"/>
+              </w:rPr>
+              <w:t>空间频率</w:t>
             </w:r>
           </w:p>
         </w:tc>
@@ -8445,7 +8981,7 @@
                 <w:b w:val="0"/>
                 <w:sz w:val="21"/>
               </w:rPr>
-              <w:t>Type-I</w:t>
+              <w:t>全反馈Type-I(UE)</w:t>
             </w:r>
           </w:p>
         </w:tc>
@@ -8631,7 +9167,7 @@
                 <w:b w:val="0"/>
                 <w:sz w:val="21"/>
               </w:rPr>
-              <w:t>Type-II</w:t>
+              <w:t>全反馈Type-II(UE)</w:t>
             </w:r>
           </w:p>
         </w:tc>
@@ -8817,7 +9353,193 @@
                 <w:b w:val="0"/>
                 <w:sz w:val="21"/>
               </w:rPr>
-              <w:t>HAQSE</w:t>
+              <w:t>Docomo(UE)</w:t>
+            </w:r>
+          </w:p>
+        </w:tc>
+        <w:tc>
+          <w:tcPr>
+            <w:tcW w:type="dxa" w:w="1236"/>
+            <w:vAlign w:val="center"/>
+            <w:tcMar>
+              <w:top w:w="50" w:type="dxa"/>
+              <w:bottom w:w="50" w:type="dxa"/>
+              <w:left w:w="80" w:type="dxa"/>
+              <w:right w:w="80" w:type="dxa"/>
+            </w:tcMar>
+          </w:tcPr>
+          <w:p>
+            <w:pPr>
+              <w:keepNext/>
+              <w:spacing w:after="0" w:line="252" w:lineRule="auto"/>
+              <w:jc w:val="center"/>
+            </w:pPr>
+            <w:r>
+              <w:rPr>
+                <w:b w:val="0"/>
+                <w:sz w:val="21"/>
+              </w:rPr>
+              <w:t>81</w:t>
+            </w:r>
+          </w:p>
+        </w:tc>
+        <w:tc>
+          <w:tcPr>
+            <w:tcW w:type="dxa" w:w="1236"/>
+            <w:vAlign w:val="center"/>
+            <w:tcMar>
+              <w:top w:w="50" w:type="dxa"/>
+              <w:bottom w:w="50" w:type="dxa"/>
+              <w:left w:w="80" w:type="dxa"/>
+              <w:right w:w="80" w:type="dxa"/>
+            </w:tcMar>
+          </w:tcPr>
+          <w:p>
+            <w:pPr>
+              <w:keepNext/>
+              <w:spacing w:after="0" w:line="252" w:lineRule="auto"/>
+              <w:jc w:val="center"/>
+            </w:pPr>
+            <w:r>
+              <w:rPr>
+                <w:b w:val="0"/>
+                <w:sz w:val="21"/>
+              </w:rPr>
+              <w:t>97</w:t>
+            </w:r>
+          </w:p>
+        </w:tc>
+        <w:tc>
+          <w:tcPr>
+            <w:tcW w:type="dxa" w:w="1236"/>
+            <w:vAlign w:val="center"/>
+            <w:tcMar>
+              <w:top w:w="50" w:type="dxa"/>
+              <w:bottom w:w="50" w:type="dxa"/>
+              <w:left w:w="80" w:type="dxa"/>
+              <w:right w:w="80" w:type="dxa"/>
+            </w:tcMar>
+          </w:tcPr>
+          <w:p>
+            <w:pPr>
+              <w:keepNext/>
+              <w:spacing w:after="0" w:line="252" w:lineRule="auto"/>
+              <w:jc w:val="center"/>
+            </w:pPr>
+            <w:r>
+              <w:rPr>
+                <w:b w:val="0"/>
+                <w:sz w:val="21"/>
+              </w:rPr>
+              <w:t>113</w:t>
+            </w:r>
+          </w:p>
+        </w:tc>
+        <w:tc>
+          <w:tcPr>
+            <w:tcW w:type="dxa" w:w="1236"/>
+            <w:vAlign w:val="center"/>
+            <w:tcMar>
+              <w:top w:w="50" w:type="dxa"/>
+              <w:bottom w:w="50" w:type="dxa"/>
+              <w:left w:w="80" w:type="dxa"/>
+              <w:right w:w="80" w:type="dxa"/>
+            </w:tcMar>
+          </w:tcPr>
+          <w:p>
+            <w:pPr>
+              <w:keepNext/>
+              <w:spacing w:after="0" w:line="252" w:lineRule="auto"/>
+              <w:jc w:val="center"/>
+            </w:pPr>
+            <w:r>
+              <w:rPr>
+                <w:b w:val="0"/>
+                <w:sz w:val="21"/>
+              </w:rPr>
+              <w:t>129</w:t>
+            </w:r>
+          </w:p>
+        </w:tc>
+        <w:tc>
+          <w:tcPr>
+            <w:tcW w:type="dxa" w:w="1236"/>
+            <w:vAlign w:val="center"/>
+            <w:tcMar>
+              <w:top w:w="50" w:type="dxa"/>
+              <w:bottom w:w="50" w:type="dxa"/>
+              <w:left w:w="80" w:type="dxa"/>
+              <w:right w:w="80" w:type="dxa"/>
+            </w:tcMar>
+          </w:tcPr>
+          <w:p>
+            <w:pPr>
+              <w:keepNext/>
+              <w:spacing w:after="0" w:line="252" w:lineRule="auto"/>
+              <w:jc w:val="center"/>
+            </w:pPr>
+            <w:r>
+              <w:rPr>
+                <w:b w:val="0"/>
+                <w:sz w:val="21"/>
+              </w:rPr>
+              <w:t>146</w:t>
+            </w:r>
+          </w:p>
+        </w:tc>
+        <w:tc>
+          <w:tcPr>
+            <w:tcW w:type="dxa" w:w="1236"/>
+            <w:vAlign w:val="center"/>
+            <w:tcMar>
+              <w:top w:w="50" w:type="dxa"/>
+              <w:bottom w:w="50" w:type="dxa"/>
+              <w:left w:w="80" w:type="dxa"/>
+              <w:right w:w="80" w:type="dxa"/>
+            </w:tcMar>
+          </w:tcPr>
+          <w:p>
+            <w:pPr>
+              <w:keepNext/>
+              <w:spacing w:after="0" w:line="252" w:lineRule="auto"/>
+              <w:jc w:val="center"/>
+            </w:pPr>
+            <w:r>
+              <w:rPr>
+                <w:b w:val="0"/>
+                <w:sz w:val="21"/>
+              </w:rPr>
+              <w:t>162</w:t>
+            </w:r>
+          </w:p>
+        </w:tc>
+      </w:tr>
+      <w:tr>
+        <w:trPr>
+          <w:cantSplit/>
+        </w:trPr>
+        <w:tc>
+          <w:tcPr>
+            <w:tcW w:type="dxa" w:w="2376"/>
+            <w:vAlign w:val="center"/>
+            <w:tcMar>
+              <w:top w:w="50" w:type="dxa"/>
+              <w:bottom w:w="50" w:type="dxa"/>
+              <w:left w:w="80" w:type="dxa"/>
+              <w:right w:w="80" w:type="dxa"/>
+            </w:tcMar>
+          </w:tcPr>
+          <w:p>
+            <w:pPr>
+              <w:keepNext/>
+              <w:spacing w:after="0" w:line="252" w:lineRule="auto"/>
+            </w:pPr>
+            <w:r>
+              <w:rPr>
+                <w:b w:val="0"/>
+                <w:sz w:val="21"/>
+              </w:rPr>
+              <w:t>空间频率</w:t>
             </w:r>
           </w:p>
         </w:tc>
@@ -9410,7 +10132,7 @@
     </w:p>
     <w:p>
       <w:r>
-        <w:t>结果：默认32×32下CPU三种几何消息为HAQSE84、DFT42、POS36 bit；UE几何方法再增加4(B−1) bit第一相位。UE的Type-I、Type-II、Docomo空间字段随AP数增长，图中展示实际打包长度。理想SVD没有有限反馈值，不将它作为0 bit可实施方法。</w:t>
+        <w:t>结果：默认32×32下CPU三种几何消息为空间频率84、DFT42、POS36 bit；UE几何方法再增加4(B−1) bit第一相位。UE的Type-I、Type-II、Docomo空间字段随AP数增长，图中展示实际打包长度。理想SVD没有有限反馈值，不将它作为0 bit可实施方法。</w:t>
       </w:r>
     </w:p>
     <w:p>
@@ -9804,7 +10526,7 @@
                 <w:b w:val="0"/>
                 <w:sz w:val="21"/>
               </w:rPr>
-              <w:t>Type-I</w:t>
+              <w:t>全反馈Type-I(UE)</w:t>
             </w:r>
           </w:p>
         </w:tc>
@@ -9964,7 +10686,7 @@
                 <w:b w:val="0"/>
                 <w:sz w:val="21"/>
               </w:rPr>
-              <w:t>Type-II</w:t>
+              <w:t>全反馈Type-II(UE)</w:t>
             </w:r>
           </w:p>
         </w:tc>
@@ -10124,7 +10846,167 @@
                 <w:b w:val="0"/>
                 <w:sz w:val="21"/>
               </w:rPr>
-              <w:t>HAQSE</w:t>
+              <w:t>Docomo(UE)</w:t>
+            </w:r>
+          </w:p>
+        </w:tc>
+        <w:tc>
+          <w:tcPr>
+            <w:tcW w:type="dxa" w:w="1483"/>
+            <w:vAlign w:val="center"/>
+            <w:tcMar>
+              <w:top w:w="50" w:type="dxa"/>
+              <w:bottom w:w="50" w:type="dxa"/>
+              <w:left w:w="80" w:type="dxa"/>
+              <w:right w:w="80" w:type="dxa"/>
+            </w:tcMar>
+          </w:tcPr>
+          <w:p>
+            <w:pPr>
+              <w:keepNext/>
+              <w:spacing w:after="0" w:line="252" w:lineRule="auto"/>
+              <w:jc w:val="center"/>
+            </w:pPr>
+            <w:r>
+              <w:rPr>
+                <w:b w:val="0"/>
+                <w:sz w:val="21"/>
+              </w:rPr>
+              <w:t>8.3700</w:t>
+            </w:r>
+          </w:p>
+        </w:tc>
+        <w:tc>
+          <w:tcPr>
+            <w:tcW w:type="dxa" w:w="1483"/>
+            <w:vAlign w:val="center"/>
+            <w:tcMar>
+              <w:top w:w="50" w:type="dxa"/>
+              <w:bottom w:w="50" w:type="dxa"/>
+              <w:left w:w="80" w:type="dxa"/>
+              <w:right w:w="80" w:type="dxa"/>
+            </w:tcMar>
+          </w:tcPr>
+          <w:p>
+            <w:pPr>
+              <w:keepNext/>
+              <w:spacing w:after="0" w:line="252" w:lineRule="auto"/>
+              <w:jc w:val="center"/>
+            </w:pPr>
+            <w:r>
+              <w:rPr>
+                <w:b w:val="0"/>
+                <w:sz w:val="21"/>
+              </w:rPr>
+              <w:t>8.3697</w:t>
+            </w:r>
+          </w:p>
+        </w:tc>
+        <w:tc>
+          <w:tcPr>
+            <w:tcW w:type="dxa" w:w="1483"/>
+            <w:vAlign w:val="center"/>
+            <w:tcMar>
+              <w:top w:w="50" w:type="dxa"/>
+              <w:bottom w:w="50" w:type="dxa"/>
+              <w:left w:w="80" w:type="dxa"/>
+              <w:right w:w="80" w:type="dxa"/>
+            </w:tcMar>
+          </w:tcPr>
+          <w:p>
+            <w:pPr>
+              <w:keepNext/>
+              <w:spacing w:after="0" w:line="252" w:lineRule="auto"/>
+              <w:jc w:val="center"/>
+            </w:pPr>
+            <w:r>
+              <w:rPr>
+                <w:b w:val="0"/>
+                <w:sz w:val="21"/>
+              </w:rPr>
+              <w:t>8.3693</w:t>
+            </w:r>
+          </w:p>
+        </w:tc>
+        <w:tc>
+          <w:tcPr>
+            <w:tcW w:type="dxa" w:w="1483"/>
+            <w:vAlign w:val="center"/>
+            <w:tcMar>
+              <w:top w:w="50" w:type="dxa"/>
+              <w:bottom w:w="50" w:type="dxa"/>
+              <w:left w:w="80" w:type="dxa"/>
+              <w:right w:w="80" w:type="dxa"/>
+            </w:tcMar>
+          </w:tcPr>
+          <w:p>
+            <w:pPr>
+              <w:keepNext/>
+              <w:spacing w:after="0" w:line="252" w:lineRule="auto"/>
+              <w:jc w:val="center"/>
+            </w:pPr>
+            <w:r>
+              <w:rPr>
+                <w:b w:val="0"/>
+                <w:sz w:val="21"/>
+              </w:rPr>
+              <w:t>8.3693</w:t>
+            </w:r>
+          </w:p>
+        </w:tc>
+        <w:tc>
+          <w:tcPr>
+            <w:tcW w:type="dxa" w:w="1483"/>
+            <w:vAlign w:val="center"/>
+            <w:tcMar>
+              <w:top w:w="50" w:type="dxa"/>
+              <w:bottom w:w="50" w:type="dxa"/>
+              <w:left w:w="80" w:type="dxa"/>
+              <w:right w:w="80" w:type="dxa"/>
+            </w:tcMar>
+          </w:tcPr>
+          <w:p>
+            <w:pPr>
+              <w:keepNext/>
+              <w:spacing w:after="0" w:line="252" w:lineRule="auto"/>
+              <w:jc w:val="center"/>
+            </w:pPr>
+            <w:r>
+              <w:rPr>
+                <w:b w:val="0"/>
+                <w:sz w:val="21"/>
+              </w:rPr>
+              <w:t>8.3694</w:t>
+            </w:r>
+          </w:p>
+        </w:tc>
+      </w:tr>
+      <w:tr>
+        <w:trPr>
+          <w:cantSplit/>
+        </w:trPr>
+        <w:tc>
+          <w:tcPr>
+            <w:tcW w:type="dxa" w:w="2376"/>
+            <w:vAlign w:val="center"/>
+            <w:tcMar>
+              <w:top w:w="50" w:type="dxa"/>
+              <w:bottom w:w="50" w:type="dxa"/>
+              <w:left w:w="80" w:type="dxa"/>
+              <w:right w:w="80" w:type="dxa"/>
+            </w:tcMar>
+          </w:tcPr>
+          <w:p>
+            <w:pPr>
+              <w:keepNext/>
+              <w:spacing w:after="0" w:line="252" w:lineRule="auto"/>
+            </w:pPr>
+            <w:r>
+              <w:rPr>
+                <w:b w:val="0"/>
+                <w:sz w:val="21"/>
+              </w:rPr>
+              <w:t>空间频率</w:t>
             </w:r>
           </w:p>
         </w:tc>
@@ -11227,7 +12109,7 @@
     </w:p>
     <w:p>
       <w:r>
-        <w:t>结果：先以连续HAQSE频率定位，再量化一次坐标。两条曲线衡量同一定位结果在坐标编码前后的误差，不存在先量化频率再定位再量化坐标的处理。坐标量化后的欧氏误差变化不直接决定共相位敏感方向的误差。</w:t>
+        <w:t>结果：先以连续空间频率定位，再量化一次坐标。两条曲线衡量同一定位结果在坐标编码前后的误差，不存在先量化频率再定位再量化坐标的处理。坐标量化后的欧氏误差变化不直接决定共相位敏感方向的误差。</w:t>
       </w:r>
     </w:p>
     <w:p>
@@ -12410,7 +13292,7 @@
     </w:p>
     <w:p>
       <w:r>
-        <w:t>以下每图均使用400位置均值，信道固定为MIX。各表列标题是图中的实际横轴数值，CPU图中的Type-I和Type-II为UE计算的共享参考；所有方法均列入对应吞吐量或开销表。</w:t>
+        <w:t>以下每图均使用400位置均值，信道固定为MIX。各表列标题是图中的实际横轴数值；CPU图中的全反馈Type-I(UE)、全反馈Type-II(UE)和Docomo(UE)均为UE计算的共享参考，定位误差图只列三种几何方法。</w:t>
       </w:r>
     </w:p>
     <w:p>
@@ -12644,7 +13526,7 @@
                 <w:b w:val="0"/>
                 <w:sz w:val="21"/>
               </w:rPr>
-              <w:t>HAQSE</w:t>
+              <w:t>空间频率</w:t>
             </w:r>
           </w:p>
         </w:tc>
@@ -13337,7 +14219,7 @@
                 <w:b w:val="0"/>
                 <w:sz w:val="21"/>
               </w:rPr>
-              <w:t>HAQSE</w:t>
+              <w:t>空间频率</w:t>
             </w:r>
           </w:p>
         </w:tc>
@@ -13958,7 +14840,7 @@
                 <w:b w:val="0"/>
                 <w:sz w:val="21"/>
               </w:rPr>
-              <w:t>HAQSE</w:t>
+              <w:t>空间频率</w:t>
             </w:r>
           </w:p>
         </w:tc>
@@ -14945,7 +15827,7 @@
                 <w:b w:val="0"/>
                 <w:sz w:val="21"/>
               </w:rPr>
-              <w:t>Type-I</w:t>
+              <w:t>全反馈Type-I(UE)</w:t>
             </w:r>
           </w:p>
         </w:tc>
@@ -15105,7 +15987,7 @@
                 <w:b w:val="0"/>
                 <w:sz w:val="21"/>
               </w:rPr>
-              <w:t>Type-II</w:t>
+              <w:t>全反馈Type-II(UE)</w:t>
             </w:r>
           </w:p>
         </w:tc>
@@ -15265,7 +16147,7 @@
                 <w:b w:val="0"/>
                 <w:sz w:val="21"/>
               </w:rPr>
-              <w:t>Docomo适配</w:t>
+              <w:t>Docomo</w:t>
             </w:r>
           </w:p>
         </w:tc>
@@ -15425,7 +16307,7 @@
                 <w:b w:val="0"/>
                 <w:sz w:val="21"/>
               </w:rPr>
-              <w:t>HAQSE</w:t>
+              <w:t>空间频率</w:t>
             </w:r>
           </w:p>
         </w:tc>
@@ -16226,7 +17108,7 @@
                 <w:b w:val="0"/>
                 <w:sz w:val="21"/>
               </w:rPr>
-              <w:t>Type-I</w:t>
+              <w:t>全反馈Type-I(UE)</w:t>
             </w:r>
           </w:p>
         </w:tc>
@@ -16334,7 +17216,7 @@
                 <w:b w:val="0"/>
                 <w:sz w:val="21"/>
               </w:rPr>
-              <w:t>Type-II</w:t>
+              <w:t>全反馈Type-II(UE)</w:t>
             </w:r>
           </w:p>
         </w:tc>
@@ -16442,7 +17324,7 @@
                 <w:b w:val="0"/>
                 <w:sz w:val="21"/>
               </w:rPr>
-              <w:t>Docomo适配</w:t>
+              <w:t>Docomo</w:t>
             </w:r>
           </w:p>
         </w:tc>
@@ -16550,7 +17432,7 @@
                 <w:b w:val="0"/>
                 <w:sz w:val="21"/>
               </w:rPr>
-              <w:t>HAQSE</w:t>
+              <w:t>空间频率</w:t>
             </w:r>
           </w:p>
         </w:tc>
@@ -17303,7 +18185,7 @@
                 <w:b w:val="0"/>
                 <w:sz w:val="21"/>
               </w:rPr>
-              <w:t>Type-I</w:t>
+              <w:t>全反馈Type-I(UE)</w:t>
             </w:r>
           </w:p>
         </w:tc>
@@ -17463,7 +18345,7 @@
                 <w:b w:val="0"/>
                 <w:sz w:val="21"/>
               </w:rPr>
-              <w:t>Type-II</w:t>
+              <w:t>全反馈Type-II(UE)</w:t>
             </w:r>
           </w:p>
         </w:tc>
@@ -17623,7 +18505,7 @@
                 <w:b w:val="0"/>
                 <w:sz w:val="21"/>
               </w:rPr>
-              <w:t>Docomo适配</w:t>
+              <w:t>Docomo</w:t>
             </w:r>
           </w:p>
         </w:tc>
@@ -17783,7 +18665,7 @@
                 <w:b w:val="0"/>
                 <w:sz w:val="21"/>
               </w:rPr>
-              <w:t>HAQSE</w:t>
+              <w:t>空间频率</w:t>
             </w:r>
           </w:p>
         </w:tc>
@@ -18560,7 +19442,7 @@
                 <w:b w:val="0"/>
                 <w:sz w:val="21"/>
               </w:rPr>
-              <w:t>Type-I</w:t>
+              <w:t>全反馈Type-I(UE)</w:t>
             </w:r>
           </w:p>
         </w:tc>
@@ -18746,7 +19628,7 @@
                 <w:b w:val="0"/>
                 <w:sz w:val="21"/>
               </w:rPr>
-              <w:t>Type-II</w:t>
+              <w:t>全反馈Type-II(UE)</w:t>
             </w:r>
           </w:p>
         </w:tc>
@@ -18932,7 +19814,7 @@
                 <w:b w:val="0"/>
                 <w:sz w:val="21"/>
               </w:rPr>
-              <w:t>Docomo适配</w:t>
+              <w:t>Docomo</w:t>
             </w:r>
           </w:p>
         </w:tc>
@@ -19118,7 +20000,7 @@
                 <w:b w:val="0"/>
                 <w:sz w:val="21"/>
               </w:rPr>
-              <w:t>HAQSE</w:t>
+              <w:t>空间频率</w:t>
             </w:r>
           </w:p>
         </w:tc>
@@ -19711,7 +20593,7 @@
     </w:p>
     <w:p>
       <w:r>
-        <w:t>结果：默认32×32下CPU三种几何消息为HAQSE84、DFT42、POS36 bit；UE几何方法再增加4(B−1) bit第一相位。UE的Type-I、Type-II、Docomo空间字段随AP数增长，图中展示实际打包长度。理想SVD没有有限反馈值，不将它作为0 bit可实施方法。</w:t>
+        <w:t>结果：默认32×32下CPU三种几何消息为空间频率84、DFT42、POS36 bit；UE几何方法再增加4(B−1) bit第一相位。UE的Type-I、Type-II、Docomo空间字段随AP数增长，图中展示实际打包长度。理想SVD没有有限反馈值，不将它作为0 bit可实施方法。</w:t>
       </w:r>
     </w:p>
     <w:p>
@@ -20105,7 +20987,7 @@
                 <w:b w:val="0"/>
                 <w:sz w:val="21"/>
               </w:rPr>
-              <w:t>Type-I</w:t>
+              <w:t>全反馈Type-I(UE)</w:t>
             </w:r>
           </w:p>
         </w:tc>
@@ -20265,7 +21147,7 @@
                 <w:b w:val="0"/>
                 <w:sz w:val="21"/>
               </w:rPr>
-              <w:t>Type-II</w:t>
+              <w:t>全反馈Type-II(UE)</w:t>
             </w:r>
           </w:p>
         </w:tc>
@@ -20425,7 +21307,7 @@
                 <w:b w:val="0"/>
                 <w:sz w:val="21"/>
               </w:rPr>
-              <w:t>Docomo适配</w:t>
+              <w:t>Docomo</w:t>
             </w:r>
           </w:p>
         </w:tc>
@@ -20585,7 +21467,7 @@
                 <w:b w:val="0"/>
                 <w:sz w:val="21"/>
               </w:rPr>
-              <w:t>HAQSE</w:t>
+              <w:t>空间频率</w:t>
             </w:r>
           </w:p>
         </w:tc>
@@ -21688,7 +22570,7 @@
     </w:p>
     <w:p>
       <w:r>
-        <w:t>结果：先以连续HAQSE频率定位，再量化一次坐标。两条曲线衡量同一定位结果在坐标编码前后的误差，不存在先量化频率再定位再量化坐标的处理。坐标量化后的欧氏误差变化不直接决定共相位敏感方向的误差。</w:t>
+        <w:t>结果：先以连续空间频率定位，再量化一次坐标。两条曲线衡量同一定位结果在坐标编码前后的误差，不存在先量化频率再定位再量化坐标的处理。坐标量化后的欧氏误差变化不直接决定共相位敏感方向的误差。</w:t>
       </w:r>
     </w:p>
     <w:p>

</xml_diff>